<commit_message>
docs: integre les MAJ J4 dans les artefacts de cadrage et supprime le dossier perturbation5 duplique
Principe : un seul fichier de reference par artefact, qui accumule tout l'historique
(pas de dossier parallele qui duplique).
- Persona Lucia Garcia (accessibilite/i18n) ajoutee a equipe-1-personas.docx.
- Axes a11y/i18n/scale ajoutes a la story map (equipe-01-story-map-v1.0.xlsx).
- Annexe analyse de risques J4 ajoutee au product backlog.
- Vision elargie, epics J4 (EP-10/11/12/13), burnup : deja presents dans cadrage.
- Suppression de docs/artefacts/perturbation5/ (contenu desormais dans les artefacts).
</commit_message>
<xml_diff>
--- a/docs/cadrage/Groupe1_product-backlogPert4.docx
+++ b/docs/cadrage/Groupe1_product-backlogPert4.docx
@@ -22311,6 +22311,570 @@
     </w:tbl>
     <w:p/>
     <w:p/>
+    <w:p>
+      <w:r>
+        <w:br w:type="page"/>
+      </w:r>
+    </w:p>
+    <w:p>
+      <w:r>
+        <w:rPr>
+          <w:b/>
+          <w:sz w:val="28"/>
+        </w:rPr>
+        <w:t>Annexe — Analyse de risques (Perturbation J4)</w:t>
+      </w:r>
+    </w:p>
+    <w:p>
+      <w:r>
+        <w:t>Criticité = Probabilité (1-3) × Impact (1-3). On traite en priorité les risques de criticité ≥ 6. Chaque risque prioritaire est relié à une action préventive déjà présente dans le backlog.</w:t>
+      </w:r>
+    </w:p>
+    <w:tbl>
+      <w:tblPr>
+        <w:tblW w:type="auto" w:w="0"/>
+        <w:tblLook w:firstColumn="1" w:firstRow="1" w:lastColumn="0" w:lastRow="0" w:noHBand="0" w:noVBand="1" w:val="04A0"/>
+      </w:tblPr>
+      <w:tblGrid>
+        <w:gridCol w:w="2200"/>
+        <w:gridCol w:w="2200"/>
+        <w:gridCol w:w="2200"/>
+        <w:gridCol w:w="2200"/>
+        <w:gridCol w:w="2200"/>
+        <w:gridCol w:w="2200"/>
+        <w:gridCol w:w="2200"/>
+      </w:tblGrid>
+      <w:tr>
+        <w:tc>
+          <w:tcPr>
+            <w:tcW w:type="dxa" w:w="2200"/>
+          </w:tcPr>
+          <w:p>
+            <w:r>
+              <w:rPr>
+                <w:b/>
+              </w:rPr>
+              <w:t>ID</w:t>
+            </w:r>
+          </w:p>
+        </w:tc>
+        <w:tc>
+          <w:tcPr>
+            <w:tcW w:type="dxa" w:w="2200"/>
+          </w:tcPr>
+          <w:p>
+            <w:r>
+              <w:rPr>
+                <w:b/>
+              </w:rPr>
+              <w:t>Risque</w:t>
+            </w:r>
+          </w:p>
+        </w:tc>
+        <w:tc>
+          <w:tcPr>
+            <w:tcW w:type="dxa" w:w="2200"/>
+          </w:tcPr>
+          <w:p>
+            <w:r>
+              <w:rPr>
+                <w:b/>
+              </w:rPr>
+              <w:t>P</w:t>
+            </w:r>
+          </w:p>
+        </w:tc>
+        <w:tc>
+          <w:tcPr>
+            <w:tcW w:type="dxa" w:w="2200"/>
+          </w:tcPr>
+          <w:p>
+            <w:r>
+              <w:rPr>
+                <w:b/>
+              </w:rPr>
+              <w:t>I</w:t>
+            </w:r>
+          </w:p>
+        </w:tc>
+        <w:tc>
+          <w:tcPr>
+            <w:tcW w:type="dxa" w:w="2200"/>
+          </w:tcPr>
+          <w:p>
+            <w:r>
+              <w:rPr>
+                <w:b/>
+              </w:rPr>
+              <w:t>Criticité</w:t>
+            </w:r>
+          </w:p>
+        </w:tc>
+        <w:tc>
+          <w:tcPr>
+            <w:tcW w:type="dxa" w:w="2200"/>
+          </w:tcPr>
+          <w:p>
+            <w:r>
+              <w:rPr>
+                <w:b/>
+              </w:rPr>
+              <w:t>Action préventive</w:t>
+            </w:r>
+          </w:p>
+        </w:tc>
+        <w:tc>
+          <w:tcPr>
+            <w:tcW w:type="dxa" w:w="2200"/>
+          </w:tcPr>
+          <w:p>
+            <w:r>
+              <w:rPr>
+                <w:b/>
+              </w:rPr>
+              <w:t>Backlog lié</w:t>
+            </w:r>
+          </w:p>
+        </w:tc>
+      </w:tr>
+      <w:tr>
+        <w:tc>
+          <w:tcPr>
+            <w:tcW w:type="dxa" w:w="2200"/>
+          </w:tcPr>
+          <w:p>
+            <w:r>
+              <w:t>R-01</w:t>
+            </w:r>
+          </w:p>
+        </w:tc>
+        <w:tc>
+          <w:tcPr>
+            <w:tcW w:type="dxa" w:w="2200"/>
+          </w:tcPr>
+          <w:p>
+            <w:r>
+              <w:t>Saturation des serveurs (afflux d'élèves connectés)</w:t>
+            </w:r>
+          </w:p>
+        </w:tc>
+        <w:tc>
+          <w:tcPr>
+            <w:tcW w:type="dxa" w:w="2200"/>
+          </w:tcPr>
+          <w:p>
+            <w:r>
+              <w:t>3</w:t>
+            </w:r>
+          </w:p>
+        </w:tc>
+        <w:tc>
+          <w:tcPr>
+            <w:tcW w:type="dxa" w:w="2200"/>
+          </w:tcPr>
+          <w:p>
+            <w:r>
+              <w:t>3</w:t>
+            </w:r>
+          </w:p>
+        </w:tc>
+        <w:tc>
+          <w:tcPr>
+            <w:tcW w:type="dxa" w:w="2200"/>
+          </w:tcPr>
+          <w:p>
+            <w:r>
+              <w:t>9</w:t>
+            </w:r>
+          </w:p>
+        </w:tc>
+        <w:tc>
+          <w:tcPr>
+            <w:tcW w:type="dxa" w:w="2200"/>
+          </w:tcPr>
+          <w:p>
+            <w:r>
+              <w:t>Tests de charge + cache</w:t>
+            </w:r>
+          </w:p>
+        </w:tc>
+        <w:tc>
+          <w:tcPr>
+            <w:tcW w:type="dxa" w:w="2200"/>
+          </w:tcPr>
+          <w:p>
+            <w:r>
+              <w:t>EP-10 / stories scale</w:t>
+            </w:r>
+          </w:p>
+        </w:tc>
+      </w:tr>
+      <w:tr>
+        <w:tc>
+          <w:tcPr>
+            <w:tcW w:type="dxa" w:w="2200"/>
+          </w:tcPr>
+          <w:p>
+            <w:r>
+              <w:t>R-02</w:t>
+            </w:r>
+          </w:p>
+        </w:tc>
+        <w:tc>
+          <w:tcPr>
+            <w:tcW w:type="dxa" w:w="2200"/>
+          </w:tcPr>
+          <w:p>
+            <w:r>
+              <w:t>Non-conformité RGAA bloquant l'adoption par l'État</w:t>
+            </w:r>
+          </w:p>
+        </w:tc>
+        <w:tc>
+          <w:tcPr>
+            <w:tcW w:type="dxa" w:w="2200"/>
+          </w:tcPr>
+          <w:p>
+            <w:r>
+              <w:t>3</w:t>
+            </w:r>
+          </w:p>
+        </w:tc>
+        <w:tc>
+          <w:tcPr>
+            <w:tcW w:type="dxa" w:w="2200"/>
+          </w:tcPr>
+          <w:p>
+            <w:r>
+              <w:t>3</w:t>
+            </w:r>
+          </w:p>
+        </w:tc>
+        <w:tc>
+          <w:tcPr>
+            <w:tcW w:type="dxa" w:w="2200"/>
+          </w:tcPr>
+          <w:p>
+            <w:r>
+              <w:t>9</w:t>
+            </w:r>
+          </w:p>
+        </w:tc>
+        <w:tc>
+          <w:tcPr>
+            <w:tcW w:type="dxa" w:w="2200"/>
+          </w:tcPr>
+          <w:p>
+            <w:r>
+              <w:t>Audit RGAA + corrections prioritaires</w:t>
+            </w:r>
+          </w:p>
+        </w:tc>
+        <w:tc>
+          <w:tcPr>
+            <w:tcW w:type="dxa" w:w="2200"/>
+          </w:tcPr>
+          <w:p>
+            <w:r>
+              <w:t>EP-11 / stories a11y</w:t>
+            </w:r>
+          </w:p>
+        </w:tc>
+      </w:tr>
+      <w:tr>
+        <w:tc>
+          <w:tcPr>
+            <w:tcW w:type="dxa" w:w="2200"/>
+          </w:tcPr>
+          <w:p>
+            <w:r>
+              <w:t>R-03</w:t>
+            </w:r>
+          </w:p>
+        </w:tc>
+        <w:tc>
+          <w:tcPr>
+            <w:tcW w:type="dxa" w:w="2200"/>
+          </w:tcPr>
+          <w:p>
+            <w:r>
+              <w:t>Mauvaise traduction interface ou réponses IA</w:t>
+            </w:r>
+          </w:p>
+        </w:tc>
+        <w:tc>
+          <w:tcPr>
+            <w:tcW w:type="dxa" w:w="2200"/>
+          </w:tcPr>
+          <w:p>
+            <w:r>
+              <w:t>2</w:t>
+            </w:r>
+          </w:p>
+        </w:tc>
+        <w:tc>
+          <w:tcPr>
+            <w:tcW w:type="dxa" w:w="2200"/>
+          </w:tcPr>
+          <w:p>
+            <w:r>
+              <w:t>3</w:t>
+            </w:r>
+          </w:p>
+        </w:tc>
+        <w:tc>
+          <w:tcPr>
+            <w:tcW w:type="dxa" w:w="2200"/>
+          </w:tcPr>
+          <w:p>
+            <w:r>
+              <w:t>6</w:t>
+            </w:r>
+          </w:p>
+        </w:tc>
+        <w:tc>
+          <w:tcPr>
+            <w:tcW w:type="dxa" w:w="2200"/>
+          </w:tcPr>
+          <w:p>
+            <w:r>
+              <w:t>Externaliser les textes + tester le multilingue</w:t>
+            </w:r>
+          </w:p>
+        </w:tc>
+        <w:tc>
+          <w:tcPr>
+            <w:tcW w:type="dxa" w:w="2200"/>
+          </w:tcPr>
+          <w:p>
+            <w:r>
+              <w:t>EP-12 / stories i18n</w:t>
+            </w:r>
+          </w:p>
+        </w:tc>
+      </w:tr>
+      <w:tr>
+        <w:tc>
+          <w:tcPr>
+            <w:tcW w:type="dxa" w:w="2200"/>
+          </w:tcPr>
+          <w:p>
+            <w:r>
+              <w:t>R-04</w:t>
+            </w:r>
+          </w:p>
+        </w:tc>
+        <w:tc>
+          <w:tcPr>
+            <w:tcW w:type="dxa" w:w="2200"/>
+          </w:tcPr>
+          <w:p>
+            <w:r>
+              <w:t>Dépendance à un seul fournisseur LLM</w:t>
+            </w:r>
+          </w:p>
+        </w:tc>
+        <w:tc>
+          <w:tcPr>
+            <w:tcW w:type="dxa" w:w="2200"/>
+          </w:tcPr>
+          <w:p>
+            <w:r>
+              <w:t>2</w:t>
+            </w:r>
+          </w:p>
+        </w:tc>
+        <w:tc>
+          <w:tcPr>
+            <w:tcW w:type="dxa" w:w="2200"/>
+          </w:tcPr>
+          <w:p>
+            <w:r>
+              <w:t>3</w:t>
+            </w:r>
+          </w:p>
+        </w:tc>
+        <w:tc>
+          <w:tcPr>
+            <w:tcW w:type="dxa" w:w="2200"/>
+          </w:tcPr>
+          <w:p>
+            <w:r>
+              <w:t>6</w:t>
+            </w:r>
+          </w:p>
+        </w:tc>
+        <w:tc>
+          <w:tcPr>
+            <w:tcW w:type="dxa" w:w="2200"/>
+          </w:tcPr>
+          <w:p>
+            <w:r>
+              <w:t>Fournisseur IA de secours (fallback)</w:t>
+            </w:r>
+          </w:p>
+        </w:tc>
+        <w:tc>
+          <w:tcPr>
+            <w:tcW w:type="dxa" w:w="2200"/>
+          </w:tcPr>
+          <w:p>
+            <w:r>
+              <w:t>EP-13 / risque</w:t>
+            </w:r>
+          </w:p>
+        </w:tc>
+      </w:tr>
+      <w:tr>
+        <w:tc>
+          <w:tcPr>
+            <w:tcW w:type="dxa" w:w="2200"/>
+          </w:tcPr>
+          <w:p>
+            <w:r>
+              <w:t>R-05</w:t>
+            </w:r>
+          </w:p>
+        </w:tc>
+        <w:tc>
+          <w:tcPr>
+            <w:tcW w:type="dxa" w:w="2200"/>
+          </w:tcPr>
+          <w:p>
+            <w:r>
+              <w:t>Retard projet dû aux nouvelles exigences</w:t>
+            </w:r>
+          </w:p>
+        </w:tc>
+        <w:tc>
+          <w:tcPr>
+            <w:tcW w:type="dxa" w:w="2200"/>
+          </w:tcPr>
+          <w:p>
+            <w:r>
+              <w:t>3</w:t>
+            </w:r>
+          </w:p>
+        </w:tc>
+        <w:tc>
+          <w:tcPr>
+            <w:tcW w:type="dxa" w:w="2200"/>
+          </w:tcPr>
+          <w:p>
+            <w:r>
+              <w:t>2</w:t>
+            </w:r>
+          </w:p>
+        </w:tc>
+        <w:tc>
+          <w:tcPr>
+            <w:tcW w:type="dxa" w:w="2200"/>
+          </w:tcPr>
+          <w:p>
+            <w:r>
+              <w:t>6</w:t>
+            </w:r>
+          </w:p>
+        </w:tc>
+        <w:tc>
+          <w:tcPr>
+            <w:tcW w:type="dxa" w:w="2200"/>
+          </w:tcPr>
+          <w:p>
+            <w:r>
+              <w:t>Reprioriser le backlog, reporter le non-essentiel</w:t>
+            </w:r>
+          </w:p>
+        </w:tc>
+        <w:tc>
+          <w:tcPr>
+            <w:tcW w:type="dxa" w:w="2200"/>
+          </w:tcPr>
+          <w:p>
+            <w:r>
+              <w:t>Release Planning</w:t>
+            </w:r>
+          </w:p>
+        </w:tc>
+      </w:tr>
+      <w:tr>
+        <w:tc>
+          <w:tcPr>
+            <w:tcW w:type="dxa" w:w="2200"/>
+          </w:tcPr>
+          <w:p>
+            <w:r>
+              <w:t>R-06</w:t>
+            </w:r>
+          </w:p>
+        </w:tc>
+        <w:tc>
+          <w:tcPr>
+            <w:tcW w:type="dxa" w:w="2200"/>
+          </w:tcPr>
+          <w:p>
+            <w:r>
+              <w:t>Dégradation UX pendant la montée en charge</w:t>
+            </w:r>
+          </w:p>
+        </w:tc>
+        <w:tc>
+          <w:tcPr>
+            <w:tcW w:type="dxa" w:w="2200"/>
+          </w:tcPr>
+          <w:p>
+            <w:r>
+              <w:t>2</w:t>
+            </w:r>
+          </w:p>
+        </w:tc>
+        <w:tc>
+          <w:tcPr>
+            <w:tcW w:type="dxa" w:w="2200"/>
+          </w:tcPr>
+          <w:p>
+            <w:r>
+              <w:t>2</w:t>
+            </w:r>
+          </w:p>
+        </w:tc>
+        <w:tc>
+          <w:tcPr>
+            <w:tcW w:type="dxa" w:w="2200"/>
+          </w:tcPr>
+          <w:p>
+            <w:r>
+              <w:t>4</w:t>
+            </w:r>
+          </w:p>
+        </w:tc>
+        <w:tc>
+          <w:tcPr>
+            <w:tcW w:type="dxa" w:w="2200"/>
+          </w:tcPr>
+          <w:p>
+            <w:r>
+              <w:t>Surveillance perfs + priorité pages critiques</w:t>
+            </w:r>
+          </w:p>
+        </w:tc>
+        <w:tc>
+          <w:tcPr>
+            <w:tcW w:type="dxa" w:w="2200"/>
+          </w:tcPr>
+          <w:p>
+            <w:r>
+              <w:t>EP-10 / observabilité</w:t>
+            </w:r>
+          </w:p>
+        </w:tc>
+      </w:tr>
+    </w:tbl>
+    <w:p>
+      <w:r>
+        <w:t>Le burndown de sprint et le burnup de projet (impact du périmètre J4) sont tenus dans le Release Planning (onglet « Burnup global »).</w:t>
+      </w:r>
+    </w:p>
     <w:sectPr>
       <w:type w:val="nextPage"/>
       <w:pgSz w:w="16838" w:h="11906" w:code="0" w:orient="landscape"/>

</xml_diff>